<commit_message>
Add Flag and Pennant Alert
</commit_message>
<xml_diff>
--- a/Documents/API Documents/4. Flag & Pennant Breakout.docx
+++ b/Documents/API Documents/4. Flag & Pennant Breakout.docx
@@ -1195,7 +1195,7 @@
         </w:trPr>
         <w:tc>
           <w:tcPr>
-            <w:tcW w:w="1883" w:type="dxa"/>
+            <w:tcW w:w="2233" w:type="dxa"/>
             <w:tcBorders>
               <w:top w:val="single" w:color="BFC5CD" w:sz="4" w:space="0"/>
               <w:left w:val="single" w:color="BFC5CD" w:sz="4" w:space="0"/>
@@ -1230,7 +1230,7 @@
         </w:tc>
         <w:tc>
           <w:tcPr>
-            <w:tcW w:w="1068" w:type="dxa"/>
+            <w:tcW w:w="1051" w:type="dxa"/>
             <w:tcBorders>
               <w:top w:val="single" w:color="BFC5CD" w:sz="4" w:space="0"/>
               <w:left w:val="single" w:color="BFC5CD" w:sz="4" w:space="0"/>
@@ -1265,7 +1265,7 @@
         </w:tc>
         <w:tc>
           <w:tcPr>
-            <w:tcW w:w="6075" w:type="dxa"/>
+            <w:tcW w:w="5742" w:type="dxa"/>
             <w:tcBorders>
               <w:top w:val="single" w:color="BFC5CD" w:sz="4" w:space="0"/>
               <w:left w:val="single" w:color="BFC5CD" w:sz="4" w:space="0"/>
@@ -1318,7 +1318,7 @@
         </w:tblPrEx>
         <w:tc>
           <w:tcPr>
-            <w:tcW w:w="1883" w:type="dxa"/>
+            <w:tcW w:w="2233" w:type="dxa"/>
             <w:tcBorders>
               <w:top w:val="single" w:color="BFC5CD" w:sz="4" w:space="0"/>
               <w:left w:val="single" w:color="BFC5CD" w:sz="4" w:space="0"/>
@@ -1350,7 +1350,7 @@
         </w:tc>
         <w:tc>
           <w:tcPr>
-            <w:tcW w:w="1068" w:type="dxa"/>
+            <w:tcW w:w="1051" w:type="dxa"/>
             <w:tcBorders>
               <w:top w:val="single" w:color="BFC5CD" w:sz="4" w:space="0"/>
               <w:left w:val="single" w:color="BFC5CD" w:sz="4" w:space="0"/>
@@ -1382,7 +1382,7 @@
         </w:tc>
         <w:tc>
           <w:tcPr>
-            <w:tcW w:w="6075" w:type="dxa"/>
+            <w:tcW w:w="5742" w:type="dxa"/>
             <w:tcBorders>
               <w:top w:val="single" w:color="BFC5CD" w:sz="4" w:space="0"/>
               <w:left w:val="single" w:color="BFC5CD" w:sz="4" w:space="0"/>
@@ -1432,7 +1432,7 @@
         </w:tblPrEx>
         <w:tc>
           <w:tcPr>
-            <w:tcW w:w="1883" w:type="dxa"/>
+            <w:tcW w:w="2233" w:type="dxa"/>
             <w:tcBorders>
               <w:top w:val="single" w:color="BFC5CD" w:sz="4" w:space="0"/>
               <w:left w:val="single" w:color="BFC5CD" w:sz="4" w:space="0"/>
@@ -1464,7 +1464,7 @@
         </w:tc>
         <w:tc>
           <w:tcPr>
-            <w:tcW w:w="1068" w:type="dxa"/>
+            <w:tcW w:w="1051" w:type="dxa"/>
             <w:tcBorders>
               <w:top w:val="single" w:color="BFC5CD" w:sz="4" w:space="0"/>
               <w:left w:val="single" w:color="BFC5CD" w:sz="4" w:space="0"/>
@@ -1496,7 +1496,7 @@
         </w:tc>
         <w:tc>
           <w:tcPr>
-            <w:tcW w:w="6075" w:type="dxa"/>
+            <w:tcW w:w="5742" w:type="dxa"/>
             <w:tcBorders>
               <w:top w:val="single" w:color="BFC5CD" w:sz="4" w:space="0"/>
               <w:left w:val="single" w:color="BFC5CD" w:sz="4" w:space="0"/>
@@ -1546,7 +1546,7 @@
         </w:tblPrEx>
         <w:tc>
           <w:tcPr>
-            <w:tcW w:w="1883" w:type="dxa"/>
+            <w:tcW w:w="2233" w:type="dxa"/>
             <w:tcBorders>
               <w:top w:val="single" w:color="BFC5CD" w:sz="4" w:space="0"/>
               <w:left w:val="single" w:color="BFC5CD" w:sz="4" w:space="0"/>
@@ -1578,7 +1578,7 @@
         </w:tc>
         <w:tc>
           <w:tcPr>
-            <w:tcW w:w="1068" w:type="dxa"/>
+            <w:tcW w:w="1051" w:type="dxa"/>
             <w:tcBorders>
               <w:top w:val="single" w:color="BFC5CD" w:sz="4" w:space="0"/>
               <w:left w:val="single" w:color="BFC5CD" w:sz="4" w:space="0"/>
@@ -1610,7 +1610,7 @@
         </w:tc>
         <w:tc>
           <w:tcPr>
-            <w:tcW w:w="6075" w:type="dxa"/>
+            <w:tcW w:w="5742" w:type="dxa"/>
             <w:tcBorders>
               <w:top w:val="single" w:color="BFC5CD" w:sz="4" w:space="0"/>
               <w:left w:val="single" w:color="BFC5CD" w:sz="4" w:space="0"/>
@@ -1660,7 +1660,7 @@
         </w:tblPrEx>
         <w:tc>
           <w:tcPr>
-            <w:tcW w:w="1883" w:type="dxa"/>
+            <w:tcW w:w="2233" w:type="dxa"/>
             <w:tcBorders>
               <w:top w:val="single" w:color="BFC5CD" w:sz="4" w:space="0"/>
               <w:left w:val="single" w:color="BFC5CD" w:sz="4" w:space="0"/>
@@ -1692,7 +1692,7 @@
         </w:tc>
         <w:tc>
           <w:tcPr>
-            <w:tcW w:w="1068" w:type="dxa"/>
+            <w:tcW w:w="1051" w:type="dxa"/>
             <w:tcBorders>
               <w:top w:val="single" w:color="BFC5CD" w:sz="4" w:space="0"/>
               <w:left w:val="single" w:color="BFC5CD" w:sz="4" w:space="0"/>
@@ -1724,7 +1724,7 @@
         </w:tc>
         <w:tc>
           <w:tcPr>
-            <w:tcW w:w="6075" w:type="dxa"/>
+            <w:tcW w:w="5742" w:type="dxa"/>
             <w:tcBorders>
               <w:top w:val="single" w:color="BFC5CD" w:sz="4" w:space="0"/>
               <w:left w:val="single" w:color="BFC5CD" w:sz="4" w:space="0"/>
@@ -1774,7 +1774,7 @@
         </w:tblPrEx>
         <w:tc>
           <w:tcPr>
-            <w:tcW w:w="1883" w:type="dxa"/>
+            <w:tcW w:w="2233" w:type="dxa"/>
             <w:tcBorders>
               <w:top w:val="single" w:color="BFC5CD" w:sz="4" w:space="0"/>
               <w:left w:val="single" w:color="BFC5CD" w:sz="4" w:space="0"/>
@@ -1806,7 +1806,7 @@
         </w:tc>
         <w:tc>
           <w:tcPr>
-            <w:tcW w:w="1068" w:type="dxa"/>
+            <w:tcW w:w="1051" w:type="dxa"/>
             <w:tcBorders>
               <w:top w:val="single" w:color="BFC5CD" w:sz="4" w:space="0"/>
               <w:left w:val="single" w:color="BFC5CD" w:sz="4" w:space="0"/>
@@ -1838,7 +1838,7 @@
         </w:tc>
         <w:tc>
           <w:tcPr>
-            <w:tcW w:w="6075" w:type="dxa"/>
+            <w:tcW w:w="5742" w:type="dxa"/>
             <w:tcBorders>
               <w:top w:val="single" w:color="BFC5CD" w:sz="4" w:space="0"/>
               <w:left w:val="single" w:color="BFC5CD" w:sz="4" w:space="0"/>
@@ -1888,7 +1888,7 @@
         </w:tblPrEx>
         <w:tc>
           <w:tcPr>
-            <w:tcW w:w="1883" w:type="dxa"/>
+            <w:tcW w:w="2233" w:type="dxa"/>
             <w:tcBorders>
               <w:top w:val="single" w:color="BFC5CD" w:sz="4" w:space="0"/>
               <w:left w:val="single" w:color="BFC5CD" w:sz="4" w:space="0"/>
@@ -1920,7 +1920,7 @@
         </w:tc>
         <w:tc>
           <w:tcPr>
-            <w:tcW w:w="1068" w:type="dxa"/>
+            <w:tcW w:w="1051" w:type="dxa"/>
             <w:tcBorders>
               <w:top w:val="single" w:color="BFC5CD" w:sz="4" w:space="0"/>
               <w:left w:val="single" w:color="BFC5CD" w:sz="4" w:space="0"/>
@@ -1952,7 +1952,7 @@
         </w:tc>
         <w:tc>
           <w:tcPr>
-            <w:tcW w:w="6075" w:type="dxa"/>
+            <w:tcW w:w="5742" w:type="dxa"/>
             <w:tcBorders>
               <w:top w:val="single" w:color="BFC5CD" w:sz="4" w:space="0"/>
               <w:left w:val="single" w:color="BFC5CD" w:sz="4" w:space="0"/>
@@ -2002,7 +2002,7 @@
         </w:tblPrEx>
         <w:tc>
           <w:tcPr>
-            <w:tcW w:w="1883" w:type="dxa"/>
+            <w:tcW w:w="2233" w:type="dxa"/>
             <w:tcBorders>
               <w:top w:val="single" w:color="BFC5CD" w:sz="4" w:space="0"/>
               <w:left w:val="single" w:color="BFC5CD" w:sz="4" w:space="0"/>
@@ -2034,7 +2034,7 @@
         </w:tc>
         <w:tc>
           <w:tcPr>
-            <w:tcW w:w="1068" w:type="dxa"/>
+            <w:tcW w:w="1051" w:type="dxa"/>
             <w:tcBorders>
               <w:top w:val="single" w:color="BFC5CD" w:sz="4" w:space="0"/>
               <w:left w:val="single" w:color="BFC5CD" w:sz="4" w:space="0"/>
@@ -2066,7 +2066,7 @@
         </w:tc>
         <w:tc>
           <w:tcPr>
-            <w:tcW w:w="6075" w:type="dxa"/>
+            <w:tcW w:w="5742" w:type="dxa"/>
             <w:tcBorders>
               <w:top w:val="single" w:color="BFC5CD" w:sz="4" w:space="0"/>
               <w:left w:val="single" w:color="BFC5CD" w:sz="4" w:space="0"/>
@@ -2116,7 +2116,7 @@
         </w:tblPrEx>
         <w:tc>
           <w:tcPr>
-            <w:tcW w:w="1883" w:type="dxa"/>
+            <w:tcW w:w="2233" w:type="dxa"/>
             <w:tcBorders>
               <w:top w:val="single" w:color="BFC5CD" w:sz="4" w:space="0"/>
               <w:left w:val="single" w:color="BFC5CD" w:sz="4" w:space="0"/>
@@ -2148,7 +2148,7 @@
         </w:tc>
         <w:tc>
           <w:tcPr>
-            <w:tcW w:w="1068" w:type="dxa"/>
+            <w:tcW w:w="1051" w:type="dxa"/>
             <w:tcBorders>
               <w:top w:val="single" w:color="BFC5CD" w:sz="4" w:space="0"/>
               <w:left w:val="single" w:color="BFC5CD" w:sz="4" w:space="0"/>
@@ -2180,7 +2180,7 @@
         </w:tc>
         <w:tc>
           <w:tcPr>
-            <w:tcW w:w="6075" w:type="dxa"/>
+            <w:tcW w:w="5742" w:type="dxa"/>
             <w:tcBorders>
               <w:top w:val="single" w:color="BFC5CD" w:sz="4" w:space="0"/>
               <w:left w:val="single" w:color="BFC5CD" w:sz="4" w:space="0"/>
@@ -2230,7 +2230,7 @@
         </w:tblPrEx>
         <w:tc>
           <w:tcPr>
-            <w:tcW w:w="1883" w:type="dxa"/>
+            <w:tcW w:w="2233" w:type="dxa"/>
             <w:tcBorders>
               <w:top w:val="single" w:color="BFC5CD" w:sz="4" w:space="0"/>
               <w:left w:val="single" w:color="BFC5CD" w:sz="4" w:space="0"/>
@@ -2262,7 +2262,7 @@
         </w:tc>
         <w:tc>
           <w:tcPr>
-            <w:tcW w:w="1068" w:type="dxa"/>
+            <w:tcW w:w="1051" w:type="dxa"/>
             <w:tcBorders>
               <w:top w:val="single" w:color="BFC5CD" w:sz="4" w:space="0"/>
               <w:left w:val="single" w:color="BFC5CD" w:sz="4" w:space="0"/>
@@ -2294,7 +2294,7 @@
         </w:tc>
         <w:tc>
           <w:tcPr>
-            <w:tcW w:w="6075" w:type="dxa"/>
+            <w:tcW w:w="5742" w:type="dxa"/>
             <w:tcBorders>
               <w:top w:val="single" w:color="BFC5CD" w:sz="4" w:space="0"/>
               <w:left w:val="single" w:color="BFC5CD" w:sz="4" w:space="0"/>
@@ -2344,7 +2344,7 @@
         </w:tblPrEx>
         <w:tc>
           <w:tcPr>
-            <w:tcW w:w="1883" w:type="dxa"/>
+            <w:tcW w:w="2233" w:type="dxa"/>
             <w:tcBorders>
               <w:top w:val="single" w:color="BFC5CD" w:sz="4" w:space="0"/>
               <w:left w:val="single" w:color="BFC5CD" w:sz="4" w:space="0"/>
@@ -2376,7 +2376,7 @@
         </w:tc>
         <w:tc>
           <w:tcPr>
-            <w:tcW w:w="1068" w:type="dxa"/>
+            <w:tcW w:w="1051" w:type="dxa"/>
             <w:tcBorders>
               <w:top w:val="single" w:color="BFC5CD" w:sz="4" w:space="0"/>
               <w:left w:val="single" w:color="BFC5CD" w:sz="4" w:space="0"/>
@@ -2408,7 +2408,7 @@
         </w:tc>
         <w:tc>
           <w:tcPr>
-            <w:tcW w:w="6075" w:type="dxa"/>
+            <w:tcW w:w="5742" w:type="dxa"/>
             <w:tcBorders>
               <w:top w:val="single" w:color="BFC5CD" w:sz="4" w:space="0"/>
               <w:left w:val="single" w:color="BFC5CD" w:sz="4" w:space="0"/>
@@ -2458,7 +2458,7 @@
         </w:tblPrEx>
         <w:tc>
           <w:tcPr>
-            <w:tcW w:w="1883" w:type="dxa"/>
+            <w:tcW w:w="2233" w:type="dxa"/>
             <w:tcBorders>
               <w:top w:val="single" w:color="BFC5CD" w:sz="4" w:space="0"/>
               <w:left w:val="single" w:color="BFC5CD" w:sz="4" w:space="0"/>
@@ -2490,7 +2490,7 @@
         </w:tc>
         <w:tc>
           <w:tcPr>
-            <w:tcW w:w="1068" w:type="dxa"/>
+            <w:tcW w:w="1051" w:type="dxa"/>
             <w:tcBorders>
               <w:top w:val="single" w:color="BFC5CD" w:sz="4" w:space="0"/>
               <w:left w:val="single" w:color="BFC5CD" w:sz="4" w:space="0"/>
@@ -2523,7 +2523,7 @@
         </w:tc>
         <w:tc>
           <w:tcPr>
-            <w:tcW w:w="6075" w:type="dxa"/>
+            <w:tcW w:w="5742" w:type="dxa"/>
             <w:tcBorders>
               <w:top w:val="single" w:color="BFC5CD" w:sz="4" w:space="0"/>
               <w:left w:val="single" w:color="BFC5CD" w:sz="4" w:space="0"/>
@@ -2573,7 +2573,7 @@
         </w:tblPrEx>
         <w:tc>
           <w:tcPr>
-            <w:tcW w:w="1883" w:type="dxa"/>
+            <w:tcW w:w="2233" w:type="dxa"/>
             <w:tcBorders>
               <w:top w:val="single" w:color="BFC5CD" w:sz="4" w:space="0"/>
               <w:left w:val="single" w:color="BFC5CD" w:sz="4" w:space="0"/>
@@ -2605,7 +2605,7 @@
         </w:tc>
         <w:tc>
           <w:tcPr>
-            <w:tcW w:w="1068" w:type="dxa"/>
+            <w:tcW w:w="1051" w:type="dxa"/>
             <w:tcBorders>
               <w:top w:val="single" w:color="BFC5CD" w:sz="4" w:space="0"/>
               <w:left w:val="single" w:color="BFC5CD" w:sz="4" w:space="0"/>
@@ -2637,7 +2637,7 @@
         </w:tc>
         <w:tc>
           <w:tcPr>
-            <w:tcW w:w="6075" w:type="dxa"/>
+            <w:tcW w:w="5742" w:type="dxa"/>
             <w:tcBorders>
               <w:top w:val="single" w:color="BFC5CD" w:sz="4" w:space="0"/>
               <w:left w:val="single" w:color="BFC5CD" w:sz="4" w:space="0"/>
@@ -2687,7 +2687,7 @@
         </w:tblPrEx>
         <w:tc>
           <w:tcPr>
-            <w:tcW w:w="1883" w:type="dxa"/>
+            <w:tcW w:w="2233" w:type="dxa"/>
             <w:tcBorders>
               <w:top w:val="single" w:color="BFC5CD" w:sz="4" w:space="0"/>
               <w:left w:val="single" w:color="BFC5CD" w:sz="4" w:space="0"/>
@@ -2719,7 +2719,7 @@
         </w:tc>
         <w:tc>
           <w:tcPr>
-            <w:tcW w:w="1068" w:type="dxa"/>
+            <w:tcW w:w="1051" w:type="dxa"/>
             <w:tcBorders>
               <w:top w:val="single" w:color="BFC5CD" w:sz="4" w:space="0"/>
               <w:left w:val="single" w:color="BFC5CD" w:sz="4" w:space="0"/>
@@ -2751,7 +2751,7 @@
         </w:tc>
         <w:tc>
           <w:tcPr>
-            <w:tcW w:w="6075" w:type="dxa"/>
+            <w:tcW w:w="5742" w:type="dxa"/>
             <w:tcBorders>
               <w:top w:val="single" w:color="BFC5CD" w:sz="4" w:space="0"/>
               <w:left w:val="single" w:color="BFC5CD" w:sz="4" w:space="0"/>
@@ -2801,7 +2801,7 @@
         </w:tblPrEx>
         <w:tc>
           <w:tcPr>
-            <w:tcW w:w="1883" w:type="dxa"/>
+            <w:tcW w:w="2233" w:type="dxa"/>
             <w:tcBorders>
               <w:top w:val="single" w:color="BFC5CD" w:sz="4" w:space="0"/>
               <w:left w:val="single" w:color="BFC5CD" w:sz="4" w:space="0"/>
@@ -2833,7 +2833,7 @@
         </w:tc>
         <w:tc>
           <w:tcPr>
-            <w:tcW w:w="1068" w:type="dxa"/>
+            <w:tcW w:w="1051" w:type="dxa"/>
             <w:tcBorders>
               <w:top w:val="single" w:color="BFC5CD" w:sz="4" w:space="0"/>
               <w:left w:val="single" w:color="BFC5CD" w:sz="4" w:space="0"/>
@@ -2865,7 +2865,7 @@
         </w:tc>
         <w:tc>
           <w:tcPr>
-            <w:tcW w:w="6075" w:type="dxa"/>
+            <w:tcW w:w="5742" w:type="dxa"/>
             <w:tcBorders>
               <w:top w:val="single" w:color="BFC5CD" w:sz="4" w:space="0"/>
               <w:left w:val="single" w:color="BFC5CD" w:sz="4" w:space="0"/>
@@ -2915,7 +2915,7 @@
         </w:tblPrEx>
         <w:tc>
           <w:tcPr>
-            <w:tcW w:w="1883" w:type="dxa"/>
+            <w:tcW w:w="2233" w:type="dxa"/>
             <w:tcBorders>
               <w:top w:val="single" w:color="BFC5CD" w:sz="4" w:space="0"/>
               <w:left w:val="single" w:color="BFC5CD" w:sz="4" w:space="0"/>
@@ -2945,7 +2945,7 @@
         </w:tc>
         <w:tc>
           <w:tcPr>
-            <w:tcW w:w="1068" w:type="dxa"/>
+            <w:tcW w:w="1051" w:type="dxa"/>
             <w:tcBorders>
               <w:top w:val="single" w:color="BFC5CD" w:sz="4" w:space="0"/>
               <w:left w:val="single" w:color="BFC5CD" w:sz="4" w:space="0"/>
@@ -2977,7 +2977,7 @@
         </w:tc>
         <w:tc>
           <w:tcPr>
-            <w:tcW w:w="6075" w:type="dxa"/>
+            <w:tcW w:w="5742" w:type="dxa"/>
             <w:tcBorders>
               <w:top w:val="single" w:color="BFC5CD" w:sz="4" w:space="0"/>
               <w:left w:val="single" w:color="BFC5CD" w:sz="4" w:space="0"/>
@@ -3027,149 +3027,37 @@
         </w:tblPrEx>
         <w:tc>
           <w:tcPr>
-            <w:tcW w:w="1883" w:type="dxa"/>
-            <w:tcBorders>
-              <w:top w:val="single" w:color="BFC5CD" w:sz="4" w:space="0"/>
-              <w:left w:val="single" w:color="BFC5CD" w:sz="4" w:space="0"/>
-              <w:bottom w:val="single" w:color="BFC5CD" w:sz="4" w:space="0"/>
-              <w:right w:val="single" w:color="BFC5CD" w:sz="4" w:space="0"/>
-            </w:tcBorders>
-            <w:tcMar>
-              <w:top w:w="60" w:type="dxa"/>
-              <w:left w:w="100" w:type="dxa"/>
-              <w:bottom w:w="60" w:type="dxa"/>
-              <w:right w:w="100" w:type="dxa"/>
-            </w:tcMar>
-          </w:tcPr>
-          <w:p>
-            <w:pPr>
-              <w:rPr>
-                <w:rFonts w:hint="default"/>
-              </w:rPr>
-            </w:pPr>
-            <w:r>
-              <w:rPr>
-                <w:rFonts w:hint="default"/>
-              </w:rPr>
-              <w:t xml:space="preserve">breakout             </w:t>
-            </w:r>
-          </w:p>
-        </w:tc>
-        <w:tc>
-          <w:tcPr>
-            <w:tcW w:w="1068" w:type="dxa"/>
-            <w:tcBorders>
-              <w:top w:val="single" w:color="BFC5CD" w:sz="4" w:space="0"/>
-              <w:left w:val="single" w:color="BFC5CD" w:sz="4" w:space="0"/>
-              <w:bottom w:val="single" w:color="BFC5CD" w:sz="4" w:space="0"/>
-              <w:right w:val="single" w:color="BFC5CD" w:sz="4" w:space="0"/>
-            </w:tcBorders>
-            <w:tcMar>
-              <w:top w:w="60" w:type="dxa"/>
-              <w:left w:w="100" w:type="dxa"/>
-              <w:bottom w:w="60" w:type="dxa"/>
-              <w:right w:w="100" w:type="dxa"/>
-            </w:tcMar>
-          </w:tcPr>
-          <w:p>
-            <w:pPr>
-              <w:rPr>
-                <w:rFonts w:hint="default"/>
-                <w:sz w:val="20"/>
-                <w:szCs w:val="20"/>
-              </w:rPr>
-            </w:pPr>
-            <w:r>
-              <w:rPr>
-                <w:rFonts w:hint="default"/>
-              </w:rPr>
-              <w:t xml:space="preserve">bool   </w:t>
-            </w:r>
-          </w:p>
-        </w:tc>
-        <w:tc>
-          <w:tcPr>
-            <w:tcW w:w="6075" w:type="dxa"/>
-            <w:tcBorders>
-              <w:top w:val="single" w:color="BFC5CD" w:sz="4" w:space="0"/>
-              <w:left w:val="single" w:color="BFC5CD" w:sz="4" w:space="0"/>
-              <w:bottom w:val="single" w:color="BFC5CD" w:sz="4" w:space="0"/>
-              <w:right w:val="single" w:color="BFC5CD" w:sz="4" w:space="0"/>
-            </w:tcBorders>
-            <w:tcMar>
-              <w:top w:w="60" w:type="dxa"/>
-              <w:left w:w="100" w:type="dxa"/>
-              <w:bottom w:w="60" w:type="dxa"/>
-              <w:right w:w="100" w:type="dxa"/>
-            </w:tcMar>
-          </w:tcPr>
-          <w:p>
-            <w:pPr>
-              <w:rPr>
-                <w:rFonts w:hint="default"/>
-                <w:sz w:val="20"/>
-                <w:szCs w:val="20"/>
-              </w:rPr>
-            </w:pPr>
-            <w:r>
-              <w:rPr>
-                <w:rFonts w:hint="default"/>
-              </w:rPr>
-              <w:t xml:space="preserve">Indicates breakout confirmation            </w:t>
-            </w:r>
-          </w:p>
-        </w:tc>
-      </w:tr>
-      <w:tr>
-        <w:tblPrEx>
-          <w:tblBorders>
-            <w:top w:val="single" w:color="auto" w:sz="4" w:space="0"/>
-            <w:left w:val="single" w:color="auto" w:sz="4" w:space="0"/>
-            <w:bottom w:val="single" w:color="auto" w:sz="4" w:space="0"/>
-            <w:right w:val="single" w:color="auto" w:sz="4" w:space="0"/>
-            <w:insideH w:val="single" w:color="auto" w:sz="4" w:space="0"/>
-            <w:insideV w:val="single" w:color="auto" w:sz="4" w:space="0"/>
-          </w:tblBorders>
-          <w:tblCellMar>
-            <w:top w:w="0" w:type="dxa"/>
-            <w:left w:w="10" w:type="dxa"/>
-            <w:bottom w:w="0" w:type="dxa"/>
-            <w:right w:w="10" w:type="dxa"/>
-          </w:tblCellMar>
-        </w:tblPrEx>
-        <w:tc>
-          <w:tcPr>
-            <w:tcW w:w="1883" w:type="dxa"/>
-            <w:tcBorders>
-              <w:top w:val="single" w:color="BFC5CD" w:sz="4" w:space="0"/>
-              <w:left w:val="single" w:color="BFC5CD" w:sz="4" w:space="0"/>
-              <w:bottom w:val="single" w:color="BFC5CD" w:sz="4" w:space="0"/>
-              <w:right w:val="single" w:color="BFC5CD" w:sz="4" w:space="0"/>
-            </w:tcBorders>
-            <w:tcMar>
-              <w:top w:w="60" w:type="dxa"/>
-              <w:left w:w="100" w:type="dxa"/>
-              <w:bottom w:w="60" w:type="dxa"/>
-              <w:right w:w="100" w:type="dxa"/>
-            </w:tcMar>
-          </w:tcPr>
-          <w:p>
-            <w:pPr>
-              <w:rPr>
-                <w:rFonts w:hint="default"/>
-              </w:rPr>
-            </w:pPr>
-            <w:r>
-              <w:rPr>
-                <w:rFonts w:hint="default"/>
-              </w:rPr>
-              <w:t xml:space="preserve">breakoutDirection    </w:t>
-            </w:r>
-          </w:p>
-        </w:tc>
-        <w:tc>
-          <w:tcPr>
-            <w:tcW w:w="1068" w:type="dxa"/>
+            <w:tcW w:w="2233" w:type="dxa"/>
+            <w:tcBorders>
+              <w:top w:val="single" w:color="BFC5CD" w:sz="4" w:space="0"/>
+              <w:left w:val="single" w:color="BFC5CD" w:sz="4" w:space="0"/>
+              <w:bottom w:val="single" w:color="BFC5CD" w:sz="4" w:space="0"/>
+              <w:right w:val="single" w:color="BFC5CD" w:sz="4" w:space="0"/>
+            </w:tcBorders>
+            <w:tcMar>
+              <w:top w:w="60" w:type="dxa"/>
+              <w:left w:w="100" w:type="dxa"/>
+              <w:bottom w:w="60" w:type="dxa"/>
+              <w:right w:w="100" w:type="dxa"/>
+            </w:tcMar>
+          </w:tcPr>
+          <w:p>
+            <w:pPr>
+              <w:rPr>
+                <w:rFonts w:hint="default"/>
+              </w:rPr>
+            </w:pPr>
+            <w:r>
+              <w:rPr>
+                <w:rFonts w:hint="default"/>
+              </w:rPr>
+              <w:t xml:space="preserve">lastCandleDate       </w:t>
+            </w:r>
+          </w:p>
+        </w:tc>
+        <w:tc>
+          <w:tcPr>
+            <w:tcW w:w="1051" w:type="dxa"/>
             <w:tcBorders>
               <w:top w:val="single" w:color="BFC5CD" w:sz="4" w:space="0"/>
               <w:left w:val="single" w:color="BFC5CD" w:sz="4" w:space="0"/>
@@ -3201,119 +3089,7 @@
         </w:tc>
         <w:tc>
           <w:tcPr>
-            <w:tcW w:w="6075" w:type="dxa"/>
-            <w:tcBorders>
-              <w:top w:val="single" w:color="BFC5CD" w:sz="4" w:space="0"/>
-              <w:left w:val="single" w:color="BFC5CD" w:sz="4" w:space="0"/>
-              <w:bottom w:val="single" w:color="BFC5CD" w:sz="4" w:space="0"/>
-              <w:right w:val="single" w:color="BFC5CD" w:sz="4" w:space="0"/>
-            </w:tcBorders>
-            <w:tcMar>
-              <w:top w:w="60" w:type="dxa"/>
-              <w:left w:w="100" w:type="dxa"/>
-              <w:bottom w:w="60" w:type="dxa"/>
-              <w:right w:w="100" w:type="dxa"/>
-            </w:tcMar>
-          </w:tcPr>
-          <w:p>
-            <w:pPr>
-              <w:rPr>
-                <w:rFonts w:hint="default"/>
-                <w:sz w:val="20"/>
-                <w:szCs w:val="20"/>
-              </w:rPr>
-            </w:pPr>
-            <w:r>
-              <w:rPr>
-                <w:rFonts w:hint="default"/>
-              </w:rPr>
-              <w:t xml:space="preserve">`Bullish`, `Bearish`, or `None`            </w:t>
-            </w:r>
-          </w:p>
-        </w:tc>
-      </w:tr>
-      <w:tr>
-        <w:tblPrEx>
-          <w:tblBorders>
-            <w:top w:val="single" w:color="auto" w:sz="4" w:space="0"/>
-            <w:left w:val="single" w:color="auto" w:sz="4" w:space="0"/>
-            <w:bottom w:val="single" w:color="auto" w:sz="4" w:space="0"/>
-            <w:right w:val="single" w:color="auto" w:sz="4" w:space="0"/>
-            <w:insideH w:val="single" w:color="auto" w:sz="4" w:space="0"/>
-            <w:insideV w:val="single" w:color="auto" w:sz="4" w:space="0"/>
-          </w:tblBorders>
-          <w:tblCellMar>
-            <w:top w:w="0" w:type="dxa"/>
-            <w:left w:w="10" w:type="dxa"/>
-            <w:bottom w:w="0" w:type="dxa"/>
-            <w:right w:w="10" w:type="dxa"/>
-          </w:tblCellMar>
-        </w:tblPrEx>
-        <w:tc>
-          <w:tcPr>
-            <w:tcW w:w="1883" w:type="dxa"/>
-            <w:tcBorders>
-              <w:top w:val="single" w:color="BFC5CD" w:sz="4" w:space="0"/>
-              <w:left w:val="single" w:color="BFC5CD" w:sz="4" w:space="0"/>
-              <w:bottom w:val="single" w:color="BFC5CD" w:sz="4" w:space="0"/>
-              <w:right w:val="single" w:color="BFC5CD" w:sz="4" w:space="0"/>
-            </w:tcBorders>
-            <w:tcMar>
-              <w:top w:w="60" w:type="dxa"/>
-              <w:left w:w="100" w:type="dxa"/>
-              <w:bottom w:w="60" w:type="dxa"/>
-              <w:right w:w="100" w:type="dxa"/>
-            </w:tcMar>
-          </w:tcPr>
-          <w:p>
-            <w:pPr>
-              <w:rPr>
-                <w:rFonts w:hint="default"/>
-              </w:rPr>
-            </w:pPr>
-            <w:r>
-              <w:rPr>
-                <w:rFonts w:hint="default"/>
-              </w:rPr>
-              <w:t xml:space="preserve">lastCandleDate       </w:t>
-            </w:r>
-          </w:p>
-        </w:tc>
-        <w:tc>
-          <w:tcPr>
-            <w:tcW w:w="1068" w:type="dxa"/>
-            <w:tcBorders>
-              <w:top w:val="single" w:color="BFC5CD" w:sz="4" w:space="0"/>
-              <w:left w:val="single" w:color="BFC5CD" w:sz="4" w:space="0"/>
-              <w:bottom w:val="single" w:color="BFC5CD" w:sz="4" w:space="0"/>
-              <w:right w:val="single" w:color="BFC5CD" w:sz="4" w:space="0"/>
-            </w:tcBorders>
-            <w:tcMar>
-              <w:top w:w="60" w:type="dxa"/>
-              <w:left w:w="100" w:type="dxa"/>
-              <w:bottom w:w="60" w:type="dxa"/>
-              <w:right w:w="100" w:type="dxa"/>
-            </w:tcMar>
-          </w:tcPr>
-          <w:p>
-            <w:pPr>
-              <w:rPr>
-                <w:rFonts w:hint="default"/>
-                <w:sz w:val="20"/>
-                <w:szCs w:val="20"/>
-              </w:rPr>
-            </w:pPr>
-            <w:r>
-              <w:rPr>
-                <w:rFonts w:hint="default"/>
-              </w:rPr>
-              <w:t xml:space="preserve">string </w:t>
-            </w:r>
-          </w:p>
-        </w:tc>
-        <w:tc>
-          <w:tcPr>
-            <w:tcW w:w="6075" w:type="dxa"/>
+            <w:tcW w:w="5742" w:type="dxa"/>
             <w:tcBorders>
               <w:top w:val="single" w:color="BFC5CD" w:sz="4" w:space="0"/>
               <w:left w:val="single" w:color="BFC5CD" w:sz="4" w:space="0"/>
@@ -3709,6 +3485,8 @@
           <w:szCs w:val="17"/>
         </w:rPr>
       </w:pPr>
+      <w:bookmarkStart w:id="0" w:name="_GoBack"/>
+      <w:bookmarkEnd w:id="0"/>
       <w:r>
         <w:rPr>
           <w:rFonts w:hint="default" w:ascii="Consolas" w:hAnsi="Consolas" w:eastAsia="Consolas" w:cs="Consolas"/>
@@ -3716,52 +3494,6 @@
           <w:szCs w:val="17"/>
         </w:rPr>
         <w:t xml:space="preserve">  "retracementPercentage": 32.50,</w:t>
-      </w:r>
-    </w:p>
-    <w:p>
-      <w:pPr>
-        <w:pBdr>
-          <w:left w:val="single" w:color="9CA3AF" w:sz="12" w:space="6"/>
-        </w:pBdr>
-        <w:shd w:val="clear" w:color="auto" w:fill="F3F4F6"/>
-        <w:spacing w:after="160" w:line="260" w:lineRule="auto"/>
-        <w:ind w:left="120" w:right="120"/>
-        <w:rPr>
-          <w:rFonts w:hint="default" w:ascii="Consolas" w:hAnsi="Consolas" w:eastAsia="Consolas" w:cs="Consolas"/>
-          <w:sz w:val="17"/>
-          <w:szCs w:val="17"/>
-        </w:rPr>
-      </w:pPr>
-      <w:r>
-        <w:rPr>
-          <w:rFonts w:hint="default" w:ascii="Consolas" w:hAnsi="Consolas" w:eastAsia="Consolas" w:cs="Consolas"/>
-          <w:sz w:val="17"/>
-          <w:szCs w:val="17"/>
-        </w:rPr>
-        <w:t xml:space="preserve">  "breakout": false,</w:t>
-      </w:r>
-    </w:p>
-    <w:p>
-      <w:pPr>
-        <w:pBdr>
-          <w:left w:val="single" w:color="9CA3AF" w:sz="12" w:space="6"/>
-        </w:pBdr>
-        <w:shd w:val="clear" w:color="auto" w:fill="F3F4F6"/>
-        <w:spacing w:after="160" w:line="260" w:lineRule="auto"/>
-        <w:ind w:left="120" w:right="120"/>
-        <w:rPr>
-          <w:rFonts w:hint="default" w:ascii="Consolas" w:hAnsi="Consolas" w:eastAsia="Consolas" w:cs="Consolas"/>
-          <w:sz w:val="17"/>
-          <w:szCs w:val="17"/>
-        </w:rPr>
-      </w:pPr>
-      <w:r>
-        <w:rPr>
-          <w:rFonts w:hint="default" w:ascii="Consolas" w:hAnsi="Consolas" w:eastAsia="Consolas" w:cs="Consolas"/>
-          <w:sz w:val="17"/>
-          <w:szCs w:val="17"/>
-        </w:rPr>
-        <w:t xml:space="preserve">  "breakoutDirection": "None",</w:t>
       </w:r>
     </w:p>
     <w:p>
@@ -7116,8 +6848,6 @@
           <w:lang w:val="en-US"/>
         </w:rPr>
       </w:pPr>
-      <w:bookmarkStart w:id="0" w:name="_GoBack"/>
-      <w:bookmarkEnd w:id="0"/>
     </w:p>
     <w:p>
       <w:pPr>

</xml_diff>